<commit_message>
Added 'About me' content to site.
</commit_message>
<xml_diff>
--- a/file/it-helpdesk-resume.docx
+++ b/file/it-helpdesk-resume.docx
@@ -10,6 +10,7 @@
           <w:numId w:val="0"/>
         </w:numPr>
         <w:spacing w:lineRule="auto" w:line="240" w:beforeAutospacing="1" w:afterAutospacing="1"/>
+        <w:ind w:hanging="0" w:left="0"/>
         <w:outlineLvl w:val="0"/>
         <w:rPr>
           <w:rFonts w:ascii="Times New Roman" w:hAnsi="Times New Roman" w:eastAsia="Times New Roman" w:cs="Times New Roman"/>
@@ -31,20 +32,14 @@
           <w:szCs w:val="32"/>
           <w14:ligatures w14:val="none"/>
         </w:rPr>
-        <w:t>Chelsea Francisca Irish</w:t>
+        <w:t>Chelsea Irish</w:t>
         <w:br/>
       </w:r>
       <w:r>
         <w:rPr>
           <w:rFonts w:eastAsia="Times New Roman" w:cs="Times New Roman" w:ascii="Times New Roman" w:hAnsi="Times New Roman"/>
         </w:rPr>
-        <w:t xml:space="preserve">Titusville, Florida | </w:t>
-      </w:r>
-      <w:r>
-        <w:rPr>
-          <w:rFonts w:eastAsia="Times New Roman" w:cs="Times New Roman" w:ascii="Times New Roman" w:hAnsi="Times New Roman"/>
-        </w:rPr>
-        <w:t>contact@chelseairish.com</w:t>
+        <w:t>Titusville, Florida | contact@chelseairish.com</w:t>
       </w:r>
     </w:p>
     <w:p>
@@ -2042,6 +2037,7 @@
     <w:rsid w:val="00b63372"/>
     <w:pPr>
       <w:widowControl/>
+      <w:suppressAutoHyphens w:val="true"/>
       <w:bidi w:val="0"/>
       <w:spacing w:lineRule="auto" w:line="276" w:before="0" w:after="160"/>
       <w:jc w:val="left"/>
@@ -2694,6 +2690,7 @@
     <w:rsid w:val="00c313ca"/>
     <w:pPr>
       <w:widowControl/>
+      <w:suppressAutoHyphens w:val="true"/>
       <w:bidi w:val="0"/>
       <w:spacing w:lineRule="auto" w:line="240" w:before="0" w:after="0"/>
       <w:jc w:val="left"/>

</xml_diff>